<commit_message>
Upgrade store-report skill to v2 (multi-store, tracking, KPI gauges, cover page)
- Rename skill nakamachidai-report -> oc-store-report (multi-store)
- build_report.py: cover page + 目次 + page numbers; weekly progress
  tracking (前回アクション振り返り・継続課題・KPI前回比 auto-loaded from
  prior JSON); numeric-KPI achievement gauges (no external libs)
- build_summary.py: cross-store one-page summary of each store's latest report
- Regenerate 仲町台店 第1回; add 店舗横断サマリー; update SKILL.md

https://claude.ai/code/session_01TuxF6Vpy8pze8CP8fpGcRJ
</commit_message>
<xml_diff>
--- a/reports/仲町台店/仲町台店_週次レポート_第1回_20260608.docx
+++ b/reports/仲町台店/仲町台店_週次レポート_第1回_20260608.docx
@@ -2,6 +2,799 @@
 <file path=word/document.xml><?xml version="1.0" encoding="utf-8"?>
 <w:document xmlns:wpc="http://schemas.microsoft.com/office/word/2010/wordprocessingCanvas" xmlns:mo="http://schemas.microsoft.com/office/mac/office/2008/main" xmlns:mc="http://schemas.openxmlformats.org/markup-compatibility/2006" xmlns:mv="urn:schemas-microsoft-com:mac:vml" xmlns:o="urn:schemas-microsoft-com:office:office" xmlns:r="http://schemas.openxmlformats.org/officeDocument/2006/relationships" xmlns:m="http://schemas.openxmlformats.org/officeDocument/2006/math" xmlns:v="urn:schemas-microsoft-com:vml" xmlns:wp14="http://schemas.microsoft.com/office/word/2010/wordprocessingDrawing" xmlns:wp="http://schemas.openxmlformats.org/drawingml/2006/wordprocessingDrawing" xmlns:w10="urn:schemas-microsoft-com:office:word" xmlns:w="http://schemas.openxmlformats.org/wordprocessingml/2006/main" xmlns:w14="http://schemas.microsoft.com/office/word/2010/wordml" xmlns:wpg="http://schemas.microsoft.com/office/word/2010/wordprocessingGroup" xmlns:wpi="http://schemas.microsoft.com/office/word/2010/wordprocessingInk" xmlns:wne="http://schemas.microsoft.com/office/word/2006/wordml" xmlns:wps="http://schemas.microsoft.com/office/word/2010/wordprocessingShape" mc:Ignorable="w14 wp14">
   <w:body>
+    <w:p>
+      <w:pPr>
+        <w:spacing w:after="0" w:before="0"/>
+      </w:pPr>
+      <w:r>
+        <w:rPr>
+          <w:rFonts w:ascii="Yu Gothic" w:hAnsi="Yu Gothic" w:eastAsia="Yu Gothic"/>
+          <w:sz w:val="16"/>
+        </w:rPr>
+      </w:r>
+    </w:p>
+    <w:p>
+      <w:pPr>
+        <w:spacing w:after="0" w:before="0"/>
+      </w:pPr>
+      <w:r>
+        <w:rPr>
+          <w:rFonts w:ascii="Yu Gothic" w:hAnsi="Yu Gothic" w:eastAsia="Yu Gothic"/>
+          <w:sz w:val="16"/>
+        </w:rPr>
+      </w:r>
+    </w:p>
+    <w:p>
+      <w:pPr>
+        <w:spacing w:after="0" w:before="0"/>
+      </w:pPr>
+      <w:r>
+        <w:rPr>
+          <w:rFonts w:ascii="Yu Gothic" w:hAnsi="Yu Gothic" w:eastAsia="Yu Gothic"/>
+          <w:sz w:val="16"/>
+        </w:rPr>
+      </w:r>
+    </w:p>
+    <w:p>
+      <w:pPr>
+        <w:jc w:val="center"/>
+      </w:pPr>
+      <w:r>
+        <w:rPr>
+          <w:rFonts w:ascii="Yu Gothic" w:hAnsi="Yu Gothic" w:eastAsia="Yu Gothic"/>
+          <w:b/>
+          <w:color w:val="2E5E8C"/>
+          <w:sz w:val="26"/>
+        </w:rPr>
+        <w:t>オーナーズコンパス</w:t>
+      </w:r>
+    </w:p>
+    <w:p>
+      <w:pPr>
+        <w:spacing w:before="40"/>
+        <w:jc w:val="center"/>
+      </w:pPr>
+      <w:r>
+        <w:rPr>
+          <w:rFonts w:ascii="Yu Gothic" w:hAnsi="Yu Gothic" w:eastAsia="Yu Gothic"/>
+          <w:color w:val="666666"/>
+          <w:sz w:val="21"/>
+        </w:rPr>
+        <w:t>店舗コンサルティング</w:t>
+      </w:r>
+    </w:p>
+    <w:p>
+      <w:pPr>
+        <w:spacing w:after="0" w:before="0"/>
+      </w:pPr>
+      <w:r>
+        <w:rPr>
+          <w:rFonts w:ascii="Yu Gothic" w:hAnsi="Yu Gothic" w:eastAsia="Yu Gothic"/>
+          <w:sz w:val="20"/>
+        </w:rPr>
+      </w:r>
+    </w:p>
+    <w:tbl>
+      <w:tblPr>
+        <w:tblW w:type="auto" w:w="0"/>
+        <w:tblLook w:firstColumn="1" w:firstRow="1" w:lastColumn="0" w:lastRow="0" w:noHBand="0" w:noVBand="1" w:val="04A0"/>
+        <w:jc w:val="center"/>
+        <w:tblBorders>
+          <w:top w:val="none"/>
+          <w:left w:val="none"/>
+          <w:bottom w:val="none"/>
+          <w:right w:val="none"/>
+          <w:insideH w:val="none"/>
+          <w:insideV w:val="none"/>
+        </w:tblBorders>
+      </w:tblPr>
+      <w:tblGrid>
+        <w:gridCol w:w="9865"/>
+      </w:tblGrid>
+      <w:tr>
+        <w:tc>
+          <w:tcPr>
+            <w:tcW w:type="dxa" w:w="10200"/>
+            <w:shd w:val="clear" w:color="auto" w:fill="1F3B5C"/>
+            <w:tcMar>
+              <w:top w:w="20" w:type="dxa"/>
+              <w:bottom w:w="20" w:type="dxa"/>
+              <w:start w:w="0" w:type="dxa"/>
+              <w:end w:w="0" w:type="dxa"/>
+            </w:tcMar>
+          </w:tcPr>
+          <w:p>
+            <w:pPr>
+              <w:spacing w:after="0" w:before="0"/>
+            </w:pPr>
+            <w:r>
+              <w:rPr>
+                <w:rFonts w:ascii="Yu Gothic" w:hAnsi="Yu Gothic" w:eastAsia="Yu Gothic"/>
+                <w:b w:val="0"/>
+                <w:sz w:val="2"/>
+              </w:rPr>
+            </w:r>
+          </w:p>
+        </w:tc>
+      </w:tr>
+    </w:tbl>
+    <w:p>
+      <w:pPr>
+        <w:spacing w:before="200"/>
+        <w:jc w:val="center"/>
+      </w:pPr>
+      <w:r>
+        <w:rPr>
+          <w:rFonts w:ascii="Yu Gothic" w:hAnsi="Yu Gothic" w:eastAsia="Yu Gothic"/>
+          <w:b/>
+          <w:color w:val="1F3B5C"/>
+          <w:sz w:val="68"/>
+        </w:rPr>
+        <w:t>仲町台店</w:t>
+      </w:r>
+    </w:p>
+    <w:p>
+      <w:pPr>
+        <w:jc w:val="center"/>
+      </w:pPr>
+      <w:r>
+        <w:rPr>
+          <w:rFonts w:ascii="Yu Gothic" w:hAnsi="Yu Gothic" w:eastAsia="Yu Gothic"/>
+          <w:b/>
+          <w:color w:val="1F3B5C"/>
+          <w:sz w:val="36"/>
+        </w:rPr>
+        <w:t>週次コンサルティングレポート</w:t>
+      </w:r>
+    </w:p>
+    <w:p>
+      <w:pPr>
+        <w:spacing w:before="80"/>
+        <w:jc w:val="center"/>
+      </w:pPr>
+      <w:r>
+        <w:rPr>
+          <w:rFonts w:ascii="Yu Gothic" w:hAnsi="Yu Gothic" w:eastAsia="Yu Gothic"/>
+          <w:color w:val="666666"/>
+          <w:sz w:val="22"/>
+        </w:rPr>
+        <w:t>― 店舗運営の現状報告と改善提案 ―</w:t>
+      </w:r>
+    </w:p>
+    <w:p>
+      <w:pPr>
+        <w:spacing w:after="0" w:before="0"/>
+      </w:pPr>
+      <w:r>
+        <w:rPr>
+          <w:rFonts w:ascii="Yu Gothic" w:hAnsi="Yu Gothic" w:eastAsia="Yu Gothic"/>
+          <w:sz w:val="12"/>
+        </w:rPr>
+      </w:r>
+    </w:p>
+    <w:tbl>
+      <w:tblPr>
+        <w:tblW w:type="auto" w:w="0"/>
+        <w:tblLook w:firstColumn="1" w:firstRow="1" w:lastColumn="0" w:lastRow="0" w:noHBand="0" w:noVBand="1" w:val="04A0"/>
+        <w:jc w:val="center"/>
+        <w:tblBorders>
+          <w:top w:val="none"/>
+          <w:left w:val="none"/>
+          <w:bottom w:val="none"/>
+          <w:right w:val="none"/>
+          <w:insideH w:val="none"/>
+          <w:insideV w:val="none"/>
+        </w:tblBorders>
+      </w:tblPr>
+      <w:tblGrid>
+        <w:gridCol w:w="9865"/>
+      </w:tblGrid>
+      <w:tr>
+        <w:tc>
+          <w:tcPr>
+            <w:tcW w:type="dxa" w:w="10200"/>
+            <w:shd w:val="clear" w:color="auto" w:fill="1F3B5C"/>
+            <w:tcMar>
+              <w:top w:w="20" w:type="dxa"/>
+              <w:bottom w:w="20" w:type="dxa"/>
+              <w:start w:w="0" w:type="dxa"/>
+              <w:end w:w="0" w:type="dxa"/>
+            </w:tcMar>
+          </w:tcPr>
+          <w:p>
+            <w:pPr>
+              <w:spacing w:after="0" w:before="0"/>
+            </w:pPr>
+            <w:r>
+              <w:rPr>
+                <w:rFonts w:ascii="Yu Gothic" w:hAnsi="Yu Gothic" w:eastAsia="Yu Gothic"/>
+                <w:b w:val="0"/>
+                <w:sz w:val="2"/>
+              </w:rPr>
+            </w:r>
+          </w:p>
+        </w:tc>
+      </w:tr>
+    </w:tbl>
+    <w:p>
+      <w:pPr>
+        <w:spacing w:after="0" w:before="0"/>
+      </w:pPr>
+      <w:r>
+        <w:rPr>
+          <w:rFonts w:ascii="Yu Gothic" w:hAnsi="Yu Gothic" w:eastAsia="Yu Gothic"/>
+          <w:sz w:val="28"/>
+        </w:rPr>
+      </w:r>
+    </w:p>
+    <w:tbl>
+      <w:tblPr>
+        <w:tblW w:type="auto" w:w="0"/>
+        <w:jc w:val="center"/>
+        <w:tblLook w:firstColumn="1" w:firstRow="1" w:lastColumn="0" w:lastRow="0" w:noHBand="0" w:noVBand="1" w:val="04A0"/>
+      </w:tblPr>
+      <w:tblGrid>
+        <w:gridCol w:w="1814"/>
+        <w:gridCol w:w="4535"/>
+      </w:tblGrid>
+      <w:tr>
+        <w:tc>
+          <w:tcPr>
+            <w:tcW w:type="dxa" w:w="5100"/>
+            <w:shd w:val="clear" w:color="auto" w:fill="1F3B5C"/>
+            <w:tcBorders>
+              <w:top w:val="single" w:sz="6" w:space="0" w:color="FFFFFF"/>
+              <w:left w:val="single" w:sz="6" w:space="0" w:color="FFFFFF"/>
+              <w:bottom w:val="single" w:sz="6" w:space="0" w:color="FFFFFF"/>
+              <w:right w:val="single" w:sz="6" w:space="0" w:color="FFFFFF"/>
+            </w:tcBorders>
+            <w:tcMar>
+              <w:top w:w="60" w:type="dxa"/>
+              <w:bottom w:w="60" w:type="dxa"/>
+              <w:start w:w="130" w:type="dxa"/>
+              <w:end w:w="130" w:type="dxa"/>
+            </w:tcMar>
+          </w:tcPr>
+          <w:p>
+            <w:pPr>
+              <w:spacing w:after="0" w:before="0"/>
+              <w:jc w:val="center"/>
+            </w:pPr>
+            <w:r>
+              <w:rPr>
+                <w:rFonts w:ascii="Yu Gothic" w:hAnsi="Yu Gothic" w:eastAsia="Yu Gothic"/>
+                <w:b/>
+                <w:color w:val="FFFFFF"/>
+                <w:sz w:val="20"/>
+              </w:rPr>
+              <w:t>回　数</w:t>
+            </w:r>
+          </w:p>
+        </w:tc>
+        <w:tc>
+          <w:tcPr>
+            <w:tcW w:type="dxa" w:w="5100"/>
+            <w:shd w:val="clear" w:color="auto" w:fill="EEF1F5"/>
+            <w:tcBorders>
+              <w:top w:val="single" w:sz="6" w:space="0" w:color="FFFFFF"/>
+              <w:left w:val="single" w:sz="6" w:space="0" w:color="FFFFFF"/>
+              <w:bottom w:val="single" w:sz="6" w:space="0" w:color="FFFFFF"/>
+              <w:right w:val="single" w:sz="6" w:space="0" w:color="FFFFFF"/>
+            </w:tcBorders>
+            <w:tcMar>
+              <w:top w:w="60" w:type="dxa"/>
+              <w:bottom w:w="60" w:type="dxa"/>
+              <w:start w:w="130" w:type="dxa"/>
+              <w:end w:w="130" w:type="dxa"/>
+            </w:tcMar>
+          </w:tcPr>
+          <w:p>
+            <w:pPr>
+              <w:spacing w:after="0" w:before="0"/>
+            </w:pPr>
+            <w:r>
+              <w:rPr>
+                <w:rFonts w:ascii="Yu Gothic" w:hAnsi="Yu Gothic" w:eastAsia="Yu Gothic"/>
+                <w:b/>
+                <w:color w:val="1F3B5C"/>
+                <w:sz w:val="22"/>
+              </w:rPr>
+              <w:t>第1回</w:t>
+            </w:r>
+          </w:p>
+        </w:tc>
+      </w:tr>
+      <w:tr>
+        <w:tc>
+          <w:tcPr>
+            <w:tcW w:type="dxa" w:w="1814"/>
+            <w:shd w:val="clear" w:color="auto" w:fill="1F3B5C"/>
+            <w:tcBorders>
+              <w:top w:val="single" w:sz="6" w:space="0" w:color="FFFFFF"/>
+              <w:left w:val="single" w:sz="6" w:space="0" w:color="FFFFFF"/>
+              <w:bottom w:val="single" w:sz="6" w:space="0" w:color="FFFFFF"/>
+              <w:right w:val="single" w:sz="6" w:space="0" w:color="FFFFFF"/>
+            </w:tcBorders>
+            <w:tcMar>
+              <w:top w:w="60" w:type="dxa"/>
+              <w:bottom w:w="60" w:type="dxa"/>
+              <w:start w:w="130" w:type="dxa"/>
+              <w:end w:w="130" w:type="dxa"/>
+            </w:tcMar>
+          </w:tcPr>
+          <w:p>
+            <w:pPr>
+              <w:spacing w:after="0" w:before="0"/>
+              <w:jc w:val="center"/>
+            </w:pPr>
+            <w:r>
+              <w:rPr>
+                <w:rFonts w:ascii="Yu Gothic" w:hAnsi="Yu Gothic" w:eastAsia="Yu Gothic"/>
+                <w:b/>
+                <w:color w:val="FFFFFF"/>
+                <w:sz w:val="20"/>
+              </w:rPr>
+              <w:t>訪問日</w:t>
+            </w:r>
+          </w:p>
+        </w:tc>
+        <w:tc>
+          <w:tcPr>
+            <w:tcW w:type="dxa" w:w="4535"/>
+            <w:shd w:val="clear" w:color="auto" w:fill="EEF1F5"/>
+            <w:tcBorders>
+              <w:top w:val="single" w:sz="6" w:space="0" w:color="FFFFFF"/>
+              <w:left w:val="single" w:sz="6" w:space="0" w:color="FFFFFF"/>
+              <w:bottom w:val="single" w:sz="6" w:space="0" w:color="FFFFFF"/>
+              <w:right w:val="single" w:sz="6" w:space="0" w:color="FFFFFF"/>
+            </w:tcBorders>
+            <w:tcMar>
+              <w:top w:w="60" w:type="dxa"/>
+              <w:bottom w:w="60" w:type="dxa"/>
+              <w:start w:w="130" w:type="dxa"/>
+              <w:end w:w="130" w:type="dxa"/>
+            </w:tcMar>
+          </w:tcPr>
+          <w:p>
+            <w:pPr>
+              <w:spacing w:after="0" w:before="0"/>
+            </w:pPr>
+            <w:r>
+              <w:rPr>
+                <w:rFonts w:ascii="Yu Gothic" w:hAnsi="Yu Gothic" w:eastAsia="Yu Gothic"/>
+                <w:b/>
+                <w:color w:val="1F3B5C"/>
+                <w:sz w:val="22"/>
+              </w:rPr>
+              <w:t>2026年6月8日(月)</w:t>
+            </w:r>
+          </w:p>
+        </w:tc>
+      </w:tr>
+      <w:tr>
+        <w:tc>
+          <w:tcPr>
+            <w:tcW w:type="dxa" w:w="1814"/>
+            <w:shd w:val="clear" w:color="auto" w:fill="1F3B5C"/>
+            <w:tcBorders>
+              <w:top w:val="single" w:sz="6" w:space="0" w:color="FFFFFF"/>
+              <w:left w:val="single" w:sz="6" w:space="0" w:color="FFFFFF"/>
+              <w:bottom w:val="single" w:sz="6" w:space="0" w:color="FFFFFF"/>
+              <w:right w:val="single" w:sz="6" w:space="0" w:color="FFFFFF"/>
+            </w:tcBorders>
+            <w:tcMar>
+              <w:top w:w="60" w:type="dxa"/>
+              <w:bottom w:w="60" w:type="dxa"/>
+              <w:start w:w="130" w:type="dxa"/>
+              <w:end w:w="130" w:type="dxa"/>
+            </w:tcMar>
+          </w:tcPr>
+          <w:p>
+            <w:pPr>
+              <w:spacing w:after="0" w:before="0"/>
+              <w:jc w:val="center"/>
+            </w:pPr>
+            <w:r>
+              <w:rPr>
+                <w:rFonts w:ascii="Yu Gothic" w:hAnsi="Yu Gothic" w:eastAsia="Yu Gothic"/>
+                <w:b/>
+                <w:color w:val="FFFFFF"/>
+                <w:sz w:val="20"/>
+              </w:rPr>
+              <w:t>担　当</w:t>
+            </w:r>
+          </w:p>
+        </w:tc>
+        <w:tc>
+          <w:tcPr>
+            <w:tcW w:type="dxa" w:w="4535"/>
+            <w:shd w:val="clear" w:color="auto" w:fill="EEF1F5"/>
+            <w:tcBorders>
+              <w:top w:val="single" w:sz="6" w:space="0" w:color="FFFFFF"/>
+              <w:left w:val="single" w:sz="6" w:space="0" w:color="FFFFFF"/>
+              <w:bottom w:val="single" w:sz="6" w:space="0" w:color="FFFFFF"/>
+              <w:right w:val="single" w:sz="6" w:space="0" w:color="FFFFFF"/>
+            </w:tcBorders>
+            <w:tcMar>
+              <w:top w:w="60" w:type="dxa"/>
+              <w:bottom w:w="60" w:type="dxa"/>
+              <w:start w:w="130" w:type="dxa"/>
+              <w:end w:w="130" w:type="dxa"/>
+            </w:tcMar>
+          </w:tcPr>
+          <w:p>
+            <w:pPr>
+              <w:spacing w:after="0" w:before="0"/>
+            </w:pPr>
+            <w:r>
+              <w:rPr>
+                <w:rFonts w:ascii="Yu Gothic" w:hAnsi="Yu Gothic" w:eastAsia="Yu Gothic"/>
+                <w:b/>
+                <w:color w:val="1F3B5C"/>
+                <w:sz w:val="22"/>
+              </w:rPr>
+              <w:t>小泉M</w:t>
+            </w:r>
+          </w:p>
+        </w:tc>
+      </w:tr>
+      <w:tr>
+        <w:tc>
+          <w:tcPr>
+            <w:tcW w:type="dxa" w:w="1814"/>
+            <w:shd w:val="clear" w:color="auto" w:fill="1F3B5C"/>
+            <w:tcBorders>
+              <w:top w:val="single" w:sz="6" w:space="0" w:color="FFFFFF"/>
+              <w:left w:val="single" w:sz="6" w:space="0" w:color="FFFFFF"/>
+              <w:bottom w:val="single" w:sz="6" w:space="0" w:color="FFFFFF"/>
+              <w:right w:val="single" w:sz="6" w:space="0" w:color="FFFFFF"/>
+            </w:tcBorders>
+            <w:tcMar>
+              <w:top w:w="60" w:type="dxa"/>
+              <w:bottom w:w="60" w:type="dxa"/>
+              <w:start w:w="130" w:type="dxa"/>
+              <w:end w:w="130" w:type="dxa"/>
+            </w:tcMar>
+          </w:tcPr>
+          <w:p>
+            <w:pPr>
+              <w:spacing w:after="0" w:before="0"/>
+              <w:jc w:val="center"/>
+            </w:pPr>
+            <w:r>
+              <w:rPr>
+                <w:rFonts w:ascii="Yu Gothic" w:hAnsi="Yu Gothic" w:eastAsia="Yu Gothic"/>
+                <w:b/>
+                <w:color w:val="FFFFFF"/>
+                <w:sz w:val="20"/>
+              </w:rPr>
+              <w:t>勤　務</w:t>
+            </w:r>
+          </w:p>
+        </w:tc>
+        <w:tc>
+          <w:tcPr>
+            <w:tcW w:type="dxa" w:w="4535"/>
+            <w:shd w:val="clear" w:color="auto" w:fill="EEF1F5"/>
+            <w:tcBorders>
+              <w:top w:val="single" w:sz="6" w:space="0" w:color="FFFFFF"/>
+              <w:left w:val="single" w:sz="6" w:space="0" w:color="FFFFFF"/>
+              <w:bottom w:val="single" w:sz="6" w:space="0" w:color="FFFFFF"/>
+              <w:right w:val="single" w:sz="6" w:space="0" w:color="FFFFFF"/>
+            </w:tcBorders>
+            <w:tcMar>
+              <w:top w:w="60" w:type="dxa"/>
+              <w:bottom w:w="60" w:type="dxa"/>
+              <w:start w:w="130" w:type="dxa"/>
+              <w:end w:w="130" w:type="dxa"/>
+            </w:tcMar>
+          </w:tcPr>
+          <w:p>
+            <w:pPr>
+              <w:spacing w:after="0" w:before="0"/>
+            </w:pPr>
+            <w:r>
+              <w:rPr>
+                <w:rFonts w:ascii="Yu Gothic" w:hAnsi="Yu Gothic" w:eastAsia="Yu Gothic"/>
+                <w:b/>
+                <w:color w:val="1F3B5C"/>
+                <w:sz w:val="22"/>
+              </w:rPr>
+              <w:t>毎週月曜 13:00〜17:00</w:t>
+            </w:r>
+          </w:p>
+        </w:tc>
+      </w:tr>
+      <w:tr>
+        <w:tc>
+          <w:tcPr>
+            <w:tcW w:type="dxa" w:w="1814"/>
+            <w:shd w:val="clear" w:color="auto" w:fill="1F3B5C"/>
+            <w:tcBorders>
+              <w:top w:val="single" w:sz="6" w:space="0" w:color="FFFFFF"/>
+              <w:left w:val="single" w:sz="6" w:space="0" w:color="FFFFFF"/>
+              <w:bottom w:val="single" w:sz="6" w:space="0" w:color="FFFFFF"/>
+              <w:right w:val="single" w:sz="6" w:space="0" w:color="FFFFFF"/>
+            </w:tcBorders>
+            <w:tcMar>
+              <w:top w:w="60" w:type="dxa"/>
+              <w:bottom w:w="60" w:type="dxa"/>
+              <w:start w:w="130" w:type="dxa"/>
+              <w:end w:w="130" w:type="dxa"/>
+            </w:tcMar>
+          </w:tcPr>
+          <w:p>
+            <w:pPr>
+              <w:spacing w:after="0" w:before="0"/>
+              <w:jc w:val="center"/>
+            </w:pPr>
+            <w:r>
+              <w:rPr>
+                <w:rFonts w:ascii="Yu Gothic" w:hAnsi="Yu Gothic" w:eastAsia="Yu Gothic"/>
+                <w:b/>
+                <w:color w:val="FFFFFF"/>
+                <w:sz w:val="20"/>
+              </w:rPr>
+              <w:t>作成日</w:t>
+            </w:r>
+          </w:p>
+        </w:tc>
+        <w:tc>
+          <w:tcPr>
+            <w:tcW w:type="dxa" w:w="4535"/>
+            <w:shd w:val="clear" w:color="auto" w:fill="EEF1F5"/>
+            <w:tcBorders>
+              <w:top w:val="single" w:sz="6" w:space="0" w:color="FFFFFF"/>
+              <w:left w:val="single" w:sz="6" w:space="0" w:color="FFFFFF"/>
+              <w:bottom w:val="single" w:sz="6" w:space="0" w:color="FFFFFF"/>
+              <w:right w:val="single" w:sz="6" w:space="0" w:color="FFFFFF"/>
+            </w:tcBorders>
+            <w:tcMar>
+              <w:top w:w="60" w:type="dxa"/>
+              <w:bottom w:w="60" w:type="dxa"/>
+              <w:start w:w="130" w:type="dxa"/>
+              <w:end w:w="130" w:type="dxa"/>
+            </w:tcMar>
+          </w:tcPr>
+          <w:p>
+            <w:pPr>
+              <w:spacing w:after="0" w:before="0"/>
+            </w:pPr>
+            <w:r>
+              <w:rPr>
+                <w:rFonts w:ascii="Yu Gothic" w:hAnsi="Yu Gothic" w:eastAsia="Yu Gothic"/>
+                <w:b/>
+                <w:color w:val="1F3B5C"/>
+                <w:sz w:val="22"/>
+              </w:rPr>
+              <w:t>2026年6月8日(月)</w:t>
+            </w:r>
+          </w:p>
+        </w:tc>
+      </w:tr>
+    </w:tbl>
+    <w:p>
+      <w:pPr>
+        <w:spacing w:after="0" w:before="0"/>
+      </w:pPr>
+      <w:r>
+        <w:rPr>
+          <w:rFonts w:ascii="Yu Gothic" w:hAnsi="Yu Gothic" w:eastAsia="Yu Gothic"/>
+          <w:sz w:val="32"/>
+        </w:rPr>
+      </w:r>
+    </w:p>
+    <w:tbl>
+      <w:tblPr>
+        <w:tblW w:type="auto" w:w="0"/>
+        <w:tblLook w:firstColumn="1" w:firstRow="1" w:lastColumn="0" w:lastRow="0" w:noHBand="0" w:noVBand="1" w:val="04A0"/>
+        <w:jc w:val="center"/>
+        <w:tblBorders>
+          <w:top w:val="none"/>
+          <w:left w:val="none"/>
+          <w:bottom w:val="none"/>
+          <w:right w:val="none"/>
+          <w:insideH w:val="none"/>
+          <w:insideV w:val="none"/>
+        </w:tblBorders>
+      </w:tblPr>
+      <w:tblGrid>
+        <w:gridCol w:w="6350"/>
+      </w:tblGrid>
+      <w:tr>
+        <w:tc>
+          <w:tcPr>
+            <w:tcW w:type="dxa" w:w="10200"/>
+            <w:shd w:val="clear" w:color="auto" w:fill="F7F9FC"/>
+            <w:tcBorders>
+              <w:top w:val="single" w:sz="4" w:space="0" w:color="C9D3DF"/>
+              <w:left w:val="single" w:sz="4" w:space="0" w:color="C9D3DF"/>
+              <w:bottom w:val="single" w:sz="4" w:space="0" w:color="C9D3DF"/>
+              <w:right w:val="single" w:sz="4" w:space="0" w:color="C9D3DF"/>
+            </w:tcBorders>
+            <w:tcMar>
+              <w:top w:w="110" w:type="dxa"/>
+              <w:bottom w:w="120" w:type="dxa"/>
+              <w:start w:w="180" w:type="dxa"/>
+              <w:end w:w="180" w:type="dxa"/>
+            </w:tcMar>
+          </w:tcPr>
+          <w:p>
+            <w:pPr>
+              <w:spacing w:after="0" w:before="0"/>
+            </w:pPr>
+            <w:r>
+              <w:rPr>
+                <w:rFonts w:ascii="Yu Gothic" w:hAnsi="Yu Gothic" w:eastAsia="Yu Gothic"/>
+                <w:b/>
+                <w:color w:val="1F3B5C"/>
+                <w:sz w:val="24"/>
+              </w:rPr>
+              <w:t>目　次</w:t>
+            </w:r>
+          </w:p>
+          <w:p>
+            <w:pPr>
+              <w:spacing w:after="60" w:before="40"/>
+            </w:pPr>
+            <w:r>
+              <w:rPr>
+                <w:rFonts w:ascii="Yu Gothic" w:hAnsi="Yu Gothic" w:eastAsia="Yu Gothic"/>
+                <w:b/>
+                <w:color w:val="2E5E8C"/>
+                <w:sz w:val="21"/>
+              </w:rPr>
+              <w:t xml:space="preserve">1.　</w:t>
+            </w:r>
+            <w:r>
+              <w:rPr>
+                <w:rFonts w:ascii="Yu Gothic" w:hAnsi="Yu Gothic" w:eastAsia="Yu Gothic"/>
+                <w:color w:val="333333"/>
+                <w:sz w:val="21"/>
+              </w:rPr>
+              <w:t>本日の実施作業（売場改善）</w:t>
+            </w:r>
+          </w:p>
+          <w:p>
+            <w:pPr>
+              <w:spacing w:after="60" w:before="40"/>
+            </w:pPr>
+            <w:r>
+              <w:rPr>
+                <w:rFonts w:ascii="Yu Gothic" w:hAnsi="Yu Gothic" w:eastAsia="Yu Gothic"/>
+                <w:b/>
+                <w:color w:val="2E5E8C"/>
+                <w:sz w:val="21"/>
+              </w:rPr>
+              <w:t xml:space="preserve">2.　</w:t>
+            </w:r>
+            <w:r>
+              <w:rPr>
+                <w:rFonts w:ascii="Yu Gothic" w:hAnsi="Yu Gothic" w:eastAsia="Yu Gothic"/>
+                <w:color w:val="333333"/>
+                <w:sz w:val="21"/>
+              </w:rPr>
+              <w:t>店舗の現状と気づき（課題）</w:t>
+            </w:r>
+          </w:p>
+          <w:p>
+            <w:pPr>
+              <w:spacing w:after="60" w:before="40"/>
+            </w:pPr>
+            <w:r>
+              <w:rPr>
+                <w:rFonts w:ascii="Yu Gothic" w:hAnsi="Yu Gothic" w:eastAsia="Yu Gothic"/>
+                <w:b/>
+                <w:color w:val="2E5E8C"/>
+                <w:sz w:val="21"/>
+              </w:rPr>
+              <w:t xml:space="preserve">3.　</w:t>
+            </w:r>
+            <w:r>
+              <w:rPr>
+                <w:rFonts w:ascii="Yu Gothic" w:hAnsi="Yu Gothic" w:eastAsia="Yu Gothic"/>
+                <w:color w:val="333333"/>
+                <w:sz w:val="21"/>
+              </w:rPr>
+              <w:t>オーナーへの提案・合意事項</w:t>
+            </w:r>
+          </w:p>
+          <w:p>
+            <w:pPr>
+              <w:spacing w:after="60" w:before="40"/>
+            </w:pPr>
+            <w:r>
+              <w:rPr>
+                <w:rFonts w:ascii="Yu Gothic" w:hAnsi="Yu Gothic" w:eastAsia="Yu Gothic"/>
+                <w:b/>
+                <w:color w:val="2E5E8C"/>
+                <w:sz w:val="21"/>
+              </w:rPr>
+              <w:t xml:space="preserve">4.　</w:t>
+            </w:r>
+            <w:r>
+              <w:rPr>
+                <w:rFonts w:ascii="Yu Gothic" w:hAnsi="Yu Gothic" w:eastAsia="Yu Gothic"/>
+                <w:color w:val="333333"/>
+                <w:sz w:val="21"/>
+              </w:rPr>
+              <w:t>翌週アクションプラン</w:t>
+            </w:r>
+          </w:p>
+          <w:p>
+            <w:pPr>
+              <w:spacing w:after="60" w:before="40"/>
+            </w:pPr>
+            <w:r>
+              <w:rPr>
+                <w:rFonts w:ascii="Yu Gothic" w:hAnsi="Yu Gothic" w:eastAsia="Yu Gothic"/>
+                <w:b/>
+                <w:color w:val="2E5E8C"/>
+                <w:sz w:val="21"/>
+              </w:rPr>
+              <w:t xml:space="preserve">5.　</w:t>
+            </w:r>
+            <w:r>
+              <w:rPr>
+                <w:rFonts w:ascii="Yu Gothic" w:hAnsi="Yu Gothic" w:eastAsia="Yu Gothic"/>
+                <w:color w:val="333333"/>
+                <w:sz w:val="21"/>
+              </w:rPr>
+              <w:t>重点課題と改善提案</w:t>
+            </w:r>
+          </w:p>
+          <w:p>
+            <w:pPr>
+              <w:spacing w:after="60" w:before="40"/>
+            </w:pPr>
+            <w:r>
+              <w:rPr>
+                <w:rFonts w:ascii="Yu Gothic" w:hAnsi="Yu Gothic" w:eastAsia="Yu Gothic"/>
+                <w:b/>
+                <w:color w:val="2E5E8C"/>
+                <w:sz w:val="21"/>
+              </w:rPr>
+              <w:t xml:space="preserve">6.　</w:t>
+            </w:r>
+            <w:r>
+              <w:rPr>
+                <w:rFonts w:ascii="Yu Gothic" w:hAnsi="Yu Gothic" w:eastAsia="Yu Gothic"/>
+                <w:color w:val="333333"/>
+                <w:sz w:val="21"/>
+              </w:rPr>
+              <w:t>優先順位ロードマップ</w:t>
+            </w:r>
+          </w:p>
+          <w:p>
+            <w:pPr>
+              <w:spacing w:after="60" w:before="40"/>
+            </w:pPr>
+            <w:r>
+              <w:rPr>
+                <w:rFonts w:ascii="Yu Gothic" w:hAnsi="Yu Gothic" w:eastAsia="Yu Gothic"/>
+                <w:b/>
+                <w:color w:val="2E5E8C"/>
+                <w:sz w:val="21"/>
+              </w:rPr>
+              <w:t xml:space="preserve">7.　</w:t>
+            </w:r>
+            <w:r>
+              <w:rPr>
+                <w:rFonts w:ascii="Yu Gothic" w:hAnsi="Yu Gothic" w:eastAsia="Yu Gothic"/>
+                <w:color w:val="333333"/>
+                <w:sz w:val="21"/>
+              </w:rPr>
+              <w:t>KPI・進捗管理表</w:t>
+            </w:r>
+          </w:p>
+        </w:tc>
+      </w:tr>
+    </w:tbl>
+    <w:p>
+      <w:r>
+        <w:br w:type="page"/>
+      </w:r>
+    </w:p>
     <w:tbl>
       <w:tblPr>
         <w:tblW w:type="auto" w:w="0"/>
@@ -25,8 +818,8 @@
             <w:tcW w:type="dxa" w:w="10200"/>
             <w:shd w:val="clear" w:color="auto" w:fill="1F3B5C"/>
             <w:tcMar>
-              <w:top w:w="170" w:type="dxa"/>
-              <w:bottom w:w="170" w:type="dxa"/>
+              <w:top w:w="150" w:type="dxa"/>
+              <w:bottom w:w="150" w:type="dxa"/>
               <w:start w:w="200" w:type="dxa"/>
               <w:end w:w="200" w:type="dxa"/>
             </w:tcMar>
@@ -39,24 +832,9 @@
             <w:r>
               <w:rPr>
                 <w:rFonts w:ascii="Yu Gothic" w:hAnsi="Yu Gothic" w:eastAsia="Yu Gothic"/>
-                <w:b w:val="0"/>
-                <w:color w:val="C7D6E8"/>
-                <w:sz w:val="21"/>
-              </w:rPr>
-              <w:t>オーナーズコンパス</w:t>
-            </w:r>
-          </w:p>
-          <w:p>
-            <w:pPr>
-              <w:spacing w:after="0" w:before="40"/>
-              <w:jc w:val="center"/>
-            </w:pPr>
-            <w:r>
-              <w:rPr>
-                <w:rFonts w:ascii="Yu Gothic" w:hAnsi="Yu Gothic" w:eastAsia="Yu Gothic"/>
                 <w:b/>
                 <w:color w:val="FFFFFF"/>
-                <w:sz w:val="40"/>
+                <w:sz w:val="36"/>
               </w:rPr>
               <w:t>仲町台店　週次コンサルティングレポート</w:t>
             </w:r>
@@ -71,224 +849,9 @@
                 <w:rFonts w:ascii="Yu Gothic" w:hAnsi="Yu Gothic" w:eastAsia="Yu Gothic"/>
                 <w:b w:val="0"/>
                 <w:color w:val="C7D6E8"/>
-                <w:sz w:val="21"/>
-              </w:rPr>
-              <w:t>― 店舗運営の現状報告と改善提案 ―</w:t>
-            </w:r>
-          </w:p>
-        </w:tc>
-      </w:tr>
-    </w:tbl>
-    <w:tbl>
-      <w:tblPr>
-        <w:tblW w:type="auto" w:w="0"/>
-        <w:tblLook w:firstColumn="1" w:firstRow="1" w:lastColumn="0" w:lastRow="0" w:noHBand="0" w:noVBand="1" w:val="04A0"/>
-        <w:jc w:val="center"/>
-        <w:tblBorders>
-          <w:top w:val="none"/>
-          <w:left w:val="none"/>
-          <w:bottom w:val="none"/>
-          <w:right w:val="none"/>
-          <w:insideH w:val="none"/>
-          <w:insideV w:val="none"/>
-        </w:tblBorders>
-      </w:tblPr>
-      <w:tblGrid>
-        <w:gridCol w:w="2550"/>
-        <w:gridCol w:w="2550"/>
-        <w:gridCol w:w="2550"/>
-        <w:gridCol w:w="2550"/>
-      </w:tblGrid>
-      <w:tr>
-        <w:tc>
-          <w:tcPr>
-            <w:tcW w:type="dxa" w:w="2550"/>
-            <w:shd w:val="clear" w:color="auto" w:fill="EEF1F5"/>
-            <w:tcBorders>
-              <w:top w:val="single" w:sz="4" w:space="0" w:color="C9D3DF"/>
-              <w:left w:val="single" w:sz="4" w:space="0" w:color="C9D3DF"/>
-              <w:bottom w:val="single" w:sz="4" w:space="0" w:color="C9D3DF"/>
-              <w:right w:val="single" w:sz="4" w:space="0" w:color="C9D3DF"/>
-            </w:tcBorders>
-            <w:tcMar>
-              <w:top w:w="50" w:type="dxa"/>
-              <w:bottom w:w="50" w:type="dxa"/>
-              <w:start w:w="100" w:type="dxa"/>
-              <w:end w:w="100" w:type="dxa"/>
-            </w:tcMar>
-          </w:tcPr>
-          <w:p>
-            <w:pPr>
-              <w:spacing w:after="0" w:before="0"/>
-              <w:jc w:val="center"/>
-            </w:pPr>
-            <w:r>
-              <w:rPr>
-                <w:rFonts w:ascii="Yu Gothic" w:hAnsi="Yu Gothic" w:eastAsia="Yu Gothic"/>
-                <w:b/>
-                <w:color w:val="666666"/>
-                <w:sz w:val="16"/>
-              </w:rPr>
-              <w:t>回 数</w:t>
-            </w:r>
-          </w:p>
-          <w:p>
-            <w:pPr>
-              <w:spacing w:after="0" w:before="20"/>
-              <w:jc w:val="center"/>
-            </w:pPr>
-            <w:r>
-              <w:rPr>
-                <w:rFonts w:ascii="Yu Gothic" w:hAnsi="Yu Gothic" w:eastAsia="Yu Gothic"/>
-                <w:b/>
-                <w:color w:val="1F3B5C"/>
                 <w:sz w:val="20"/>
               </w:rPr>
-              <w:t>第1回</w:t>
-            </w:r>
-          </w:p>
-        </w:tc>
-        <w:tc>
-          <w:tcPr>
-            <w:tcW w:type="dxa" w:w="2550"/>
-            <w:shd w:val="clear" w:color="auto" w:fill="EEF1F5"/>
-            <w:tcBorders>
-              <w:top w:val="single" w:sz="4" w:space="0" w:color="C9D3DF"/>
-              <w:left w:val="single" w:sz="4" w:space="0" w:color="C9D3DF"/>
-              <w:bottom w:val="single" w:sz="4" w:space="0" w:color="C9D3DF"/>
-              <w:right w:val="single" w:sz="4" w:space="0" w:color="C9D3DF"/>
-            </w:tcBorders>
-            <w:tcMar>
-              <w:top w:w="50" w:type="dxa"/>
-              <w:bottom w:w="50" w:type="dxa"/>
-              <w:start w:w="100" w:type="dxa"/>
-              <w:end w:w="100" w:type="dxa"/>
-            </w:tcMar>
-          </w:tcPr>
-          <w:p>
-            <w:pPr>
-              <w:spacing w:after="0" w:before="0"/>
-              <w:jc w:val="center"/>
-            </w:pPr>
-            <w:r>
-              <w:rPr>
-                <w:rFonts w:ascii="Yu Gothic" w:hAnsi="Yu Gothic" w:eastAsia="Yu Gothic"/>
-                <w:b/>
-                <w:color w:val="666666"/>
-                <w:sz w:val="16"/>
-              </w:rPr>
-              <w:t>訪問日</w:t>
-            </w:r>
-          </w:p>
-          <w:p>
-            <w:pPr>
-              <w:spacing w:after="0" w:before="20"/>
-              <w:jc w:val="center"/>
-            </w:pPr>
-            <w:r>
-              <w:rPr>
-                <w:rFonts w:ascii="Yu Gothic" w:hAnsi="Yu Gothic" w:eastAsia="Yu Gothic"/>
-                <w:b/>
-                <w:color w:val="1F3B5C"/>
-                <w:sz w:val="20"/>
-              </w:rPr>
-              <w:t>2026年6月8日(月)</w:t>
-            </w:r>
-          </w:p>
-        </w:tc>
-        <w:tc>
-          <w:tcPr>
-            <w:tcW w:type="dxa" w:w="2550"/>
-            <w:shd w:val="clear" w:color="auto" w:fill="EEF1F5"/>
-            <w:tcBorders>
-              <w:top w:val="single" w:sz="4" w:space="0" w:color="C9D3DF"/>
-              <w:left w:val="single" w:sz="4" w:space="0" w:color="C9D3DF"/>
-              <w:bottom w:val="single" w:sz="4" w:space="0" w:color="C9D3DF"/>
-              <w:right w:val="single" w:sz="4" w:space="0" w:color="C9D3DF"/>
-            </w:tcBorders>
-            <w:tcMar>
-              <w:top w:w="50" w:type="dxa"/>
-              <w:bottom w:w="50" w:type="dxa"/>
-              <w:start w:w="100" w:type="dxa"/>
-              <w:end w:w="100" w:type="dxa"/>
-            </w:tcMar>
-          </w:tcPr>
-          <w:p>
-            <w:pPr>
-              <w:spacing w:after="0" w:before="0"/>
-              <w:jc w:val="center"/>
-            </w:pPr>
-            <w:r>
-              <w:rPr>
-                <w:rFonts w:ascii="Yu Gothic" w:hAnsi="Yu Gothic" w:eastAsia="Yu Gothic"/>
-                <w:b/>
-                <w:color w:val="666666"/>
-                <w:sz w:val="16"/>
-              </w:rPr>
-              <w:t>担当</w:t>
-            </w:r>
-          </w:p>
-          <w:p>
-            <w:pPr>
-              <w:spacing w:after="0" w:before="20"/>
-              <w:jc w:val="center"/>
-            </w:pPr>
-            <w:r>
-              <w:rPr>
-                <w:rFonts w:ascii="Yu Gothic" w:hAnsi="Yu Gothic" w:eastAsia="Yu Gothic"/>
-                <w:b/>
-                <w:color w:val="1F3B5C"/>
-                <w:sz w:val="20"/>
-              </w:rPr>
-              <w:t>小泉M</w:t>
-            </w:r>
-          </w:p>
-        </w:tc>
-        <w:tc>
-          <w:tcPr>
-            <w:tcW w:type="dxa" w:w="2550"/>
-            <w:shd w:val="clear" w:color="auto" w:fill="EEF1F5"/>
-            <w:tcBorders>
-              <w:top w:val="single" w:sz="4" w:space="0" w:color="C9D3DF"/>
-              <w:left w:val="single" w:sz="4" w:space="0" w:color="C9D3DF"/>
-              <w:bottom w:val="single" w:sz="4" w:space="0" w:color="C9D3DF"/>
-              <w:right w:val="single" w:sz="4" w:space="0" w:color="C9D3DF"/>
-            </w:tcBorders>
-            <w:tcMar>
-              <w:top w:w="50" w:type="dxa"/>
-              <w:bottom w:w="50" w:type="dxa"/>
-              <w:start w:w="100" w:type="dxa"/>
-              <w:end w:w="100" w:type="dxa"/>
-            </w:tcMar>
-          </w:tcPr>
-          <w:p>
-            <w:pPr>
-              <w:spacing w:after="0" w:before="0"/>
-              <w:jc w:val="center"/>
-            </w:pPr>
-            <w:r>
-              <w:rPr>
-                <w:rFonts w:ascii="Yu Gothic" w:hAnsi="Yu Gothic" w:eastAsia="Yu Gothic"/>
-                <w:b/>
-                <w:color w:val="666666"/>
-                <w:sz w:val="16"/>
-              </w:rPr>
-              <w:t>勤務</w:t>
-            </w:r>
-          </w:p>
-          <w:p>
-            <w:pPr>
-              <w:spacing w:after="0" w:before="20"/>
-              <w:jc w:val="center"/>
-            </w:pPr>
-            <w:r>
-              <w:rPr>
-                <w:rFonts w:ascii="Yu Gothic" w:hAnsi="Yu Gothic" w:eastAsia="Yu Gothic"/>
-                <w:b/>
-                <w:color w:val="1F3B5C"/>
-                <w:sz w:val="20"/>
-              </w:rPr>
-              <w:t>毎週月曜 13:00〜17:00</w:t>
+              <w:t>第1回　／　2026年6月8日(月)　／　担当：小泉M</w:t>
             </w:r>
           </w:p>
         </w:tc>
@@ -4909,6 +5472,7 @@
       </w:tr>
     </w:tbl>
     <w:sectPr>
+      <w:footerReference w:type="default" r:id="rId9"/>
       <w:pgSz w:w="12240" w:h="15840"/>
       <w:pgMar w:top="794" w:right="1020" w:bottom="794" w:left="1020" w:header="720" w:footer="720" w:gutter="0"/>
       <w:cols w:space="720"/>
@@ -4916,6 +5480,43 @@
     </w:sectPr>
   </w:body>
 </w:document>
+</file>
+
+<file path=word/footer1.xml><?xml version="1.0" encoding="utf-8"?>
+<w:ftr xmlns:m="http://schemas.openxmlformats.org/officeDocument/2006/math" xmlns:mc="http://schemas.openxmlformats.org/markup-compatibility/2006" xmlns:mo="http://schemas.microsoft.com/office/mac/office/2008/main" xmlns:mv="urn:schemas-microsoft-com:mac:vml" xmlns:o="urn:schemas-microsoft-com:office:office" xmlns:r="http://schemas.openxmlformats.org/officeDocument/2006/relationships" xmlns:v="urn:schemas-microsoft-com:vml" xmlns:w10="urn:schemas-microsoft-com:office:word" xmlns:w14="http://schemas.microsoft.com/office/word/2010/wordml" xmlns:w="http://schemas.openxmlformats.org/wordprocessingml/2006/main" xmlns:wne="http://schemas.microsoft.com/office/word/2006/wordml" xmlns:wp14="http://schemas.microsoft.com/office/word/2010/wordprocessingDrawing" xmlns:wp="http://schemas.openxmlformats.org/drawingml/2006/wordprocessingDrawing" xmlns:wpc="http://schemas.microsoft.com/office/word/2010/wordprocessingCanvas" xmlns:wpg="http://schemas.microsoft.com/office/word/2010/wordprocessingGroup" xmlns:wpi="http://schemas.microsoft.com/office/word/2010/wordprocessingInk" xmlns:wps="http://schemas.microsoft.com/office/word/2010/wordprocessingShape" mc:Ignorable="w14 wp14">
+  <w:p>
+    <w:pPr>
+      <w:pStyle w:val="Footer"/>
+      <w:jc w:val="center"/>
+    </w:pPr>
+    <w:r>
+      <w:rPr>
+        <w:rFonts w:ascii="Yu Gothic" w:hAnsi="Yu Gothic" w:eastAsia="Yu Gothic"/>
+        <w:color w:val="666666"/>
+        <w:sz w:val="18"/>
+      </w:rPr>
+      <w:t xml:space="preserve">オーナーズコンパス｜仲町台店 週次レポート 第1回　　-  </w:t>
+    </w:r>
+    <w:r>
+      <w:rPr>
+        <w:rFonts w:ascii="Yu Gothic" w:hAnsi="Yu Gothic" w:eastAsia="Yu Gothic"/>
+        <w:color w:val="666666"/>
+        <w:sz w:val="18"/>
+      </w:rPr>
+      <w:fldChar w:fldCharType="begin"/>
+      <w:instrText xml:space="preserve"> PAGE </w:instrText>
+      <w:fldChar w:fldCharType="end"/>
+    </w:r>
+    <w:r>
+      <w:rPr>
+        <w:rFonts w:ascii="Yu Gothic" w:hAnsi="Yu Gothic" w:eastAsia="Yu Gothic"/>
+        <w:color w:val="666666"/>
+        <w:sz w:val="18"/>
+      </w:rPr>
+      <w:t xml:space="preserve">  -</w:t>
+    </w:r>
+  </w:p>
+</w:ftr>
 </file>
 
 <file path=word/numbering.xml><?xml version="1.0" encoding="utf-8"?>

</xml_diff>